<commit_message>
Note de réponse aux attentes : financements en trésorerie et droit de saisie libre des comptes
Co-Authored-By: Claude Opus 5.5 <noreply@anthropic.com>
</commit_message>
<xml_diff>
--- a/docs/projet/Reponse_aux_attentes.docx
+++ b/docs/projet/Reponse_aux_attentes.docx
@@ -893,7 +893,7 @@
                 <w:sz w:val="17"/>
                 <w:szCs w:val="17"/>
               </w:rPr>
-              <w:t xml:space="preserve">Position par compte et devise ; import des relevés CSV, XLSX ou ISO 20022 camt.053, soldes contrôlés ; rapprochement proposé (factures, règlements, échéances d'emprunt) ; état de rapprochement ; flux mensuels et prévision à trois mois.</w:t>
+              <w:t xml:space="preserve">Position par compte et devise ; import des relevés CSV, XLSX ou ISO 20022 camt.053, soldes contrôlés ; rapprochement proposé (factures, règlements, échéances d'emprunt) ; déblocages et remboursements anticipés d'emprunt par type d'opération ; état de rapprochement ; flux mensuels et prévision à trois mois.</w:t>
             </w:r>
           </w:p>
         </w:tc>
@@ -2173,7 +2173,7 @@
                 <w:sz w:val="17"/>
                 <w:szCs w:val="17"/>
               </w:rPr>
-              <w:t xml:space="preserve">Double authentification, droits par profil, sociétés ouvertes par utilisateur, journal des accès, sessions révocables.</w:t>
+              <w:t xml:space="preserve">Double authentification, droits par profil, sociétés ouvertes par utilisateur, journal des accès, sessions révocables ; choix libre des comptes réservé aux utilisateurs qui en ont le droit (les autres saisissent par catégorie et type d'opération).</w:t>
             </w:r>
           </w:p>
         </w:tc>

</xml_diff>